<commit_message>
Updated Content Of Outline With Potential Data Sets To Be Used
</commit_message>
<xml_diff>
--- a/Misc/Outline.docx
+++ b/Misc/Outline.docx
@@ -217,6 +217,245 @@
         </w:rPr>
         <w:t>Integrate Model into Journal</w:t>
       </w:r>
+    </w:p>
+    <w:p>
+      <w:pPr>
+        <w:rPr>
+          <w:rFonts w:ascii="Times New Roman" w:hAnsi="Times New Roman" w:cs="Times New Roman"/>
+        </w:rPr>
+      </w:pPr>
+    </w:p>
+    <w:p>
+      <w:pPr>
+        <w:rPr>
+          <w:rFonts w:ascii="Times New Roman" w:hAnsi="Times New Roman" w:cs="Times New Roman"/>
+        </w:rPr>
+      </w:pPr>
+      <w:r>
+        <w:rPr>
+          <w:rFonts w:ascii="Times New Roman" w:hAnsi="Times New Roman" w:cs="Times New Roman"/>
+        </w:rPr>
+        <w:t>Feature 1: Design Front End:</w:t>
+      </w:r>
+    </w:p>
+    <w:p>
+      <w:pPr>
+        <w:rPr>
+          <w:rFonts w:ascii="Times New Roman" w:hAnsi="Times New Roman" w:cs="Times New Roman"/>
+        </w:rPr>
+      </w:pPr>
+    </w:p>
+    <w:p>
+      <w:pPr>
+        <w:rPr>
+          <w:rFonts w:ascii="Times New Roman" w:hAnsi="Times New Roman" w:cs="Times New Roman"/>
+        </w:rPr>
+      </w:pPr>
+    </w:p>
+    <w:p>
+      <w:pPr>
+        <w:rPr>
+          <w:rFonts w:ascii="Times New Roman" w:hAnsi="Times New Roman" w:cs="Times New Roman"/>
+        </w:rPr>
+      </w:pPr>
+      <w:r>
+        <w:rPr>
+          <w:rFonts w:ascii="Times New Roman" w:hAnsi="Times New Roman" w:cs="Times New Roman"/>
+        </w:rPr>
+        <w:t>Feature 1: Design Back End:</w:t>
+      </w:r>
+    </w:p>
+    <w:p>
+      <w:pPr>
+        <w:rPr>
+          <w:rFonts w:ascii="Times New Roman" w:hAnsi="Times New Roman" w:cs="Times New Roman"/>
+        </w:rPr>
+      </w:pPr>
+    </w:p>
+    <w:p>
+      <w:pPr>
+        <w:rPr>
+          <w:rFonts w:ascii="Times New Roman" w:hAnsi="Times New Roman" w:cs="Times New Roman"/>
+        </w:rPr>
+      </w:pPr>
+    </w:p>
+    <w:p>
+      <w:pPr>
+        <w:rPr>
+          <w:rFonts w:ascii="Times New Roman" w:hAnsi="Times New Roman" w:cs="Times New Roman"/>
+        </w:rPr>
+      </w:pPr>
+      <w:r>
+        <w:rPr>
+          <w:rFonts w:ascii="Times New Roman" w:hAnsi="Times New Roman" w:cs="Times New Roman"/>
+        </w:rPr>
+        <w:t>Feature 2: Develop Model:</w:t>
+      </w:r>
+    </w:p>
+    <w:p>
+      <w:pPr>
+        <w:pStyle w:val="ListParagraph"/>
+        <w:numPr>
+          <w:ilvl w:val="0"/>
+          <w:numId w:val="5"/>
+        </w:numPr>
+        <w:rPr>
+          <w:rFonts w:ascii="Times New Roman" w:hAnsi="Times New Roman" w:cs="Times New Roman"/>
+        </w:rPr>
+      </w:pPr>
+      <w:r>
+        <w:rPr>
+          <w:rFonts w:ascii="Times New Roman" w:hAnsi="Times New Roman" w:cs="Times New Roman"/>
+        </w:rPr>
+        <w:t>Data Sets that can be Used to Train Model:</w:t>
+      </w:r>
+    </w:p>
+    <w:p>
+      <w:pPr>
+        <w:pStyle w:val="ListParagraph"/>
+        <w:numPr>
+          <w:ilvl w:val="1"/>
+          <w:numId w:val="5"/>
+        </w:numPr>
+        <w:rPr>
+          <w:rFonts w:ascii="Times New Roman" w:hAnsi="Times New Roman" w:cs="Times New Roman"/>
+        </w:rPr>
+      </w:pPr>
+      <w:r>
+        <w:rPr>
+          <w:rFonts w:ascii="Times New Roman" w:hAnsi="Times New Roman" w:cs="Times New Roman"/>
+        </w:rPr>
+        <w:t xml:space="preserve">Reddit Mental Health </w:t>
+      </w:r>
+    </w:p>
+    <w:p>
+      <w:pPr>
+        <w:pStyle w:val="ListParagraph"/>
+        <w:numPr>
+          <w:ilvl w:val="1"/>
+          <w:numId w:val="5"/>
+        </w:numPr>
+        <w:rPr>
+          <w:rFonts w:ascii="Times New Roman" w:hAnsi="Times New Roman" w:cs="Times New Roman"/>
+        </w:rPr>
+      </w:pPr>
+      <w:proofErr w:type="spellStart"/>
+      <w:r>
+        <w:rPr>
+          <w:rFonts w:ascii="Times New Roman" w:hAnsi="Times New Roman" w:cs="Times New Roman"/>
+        </w:rPr>
+        <w:t>Dreaddit</w:t>
+      </w:r>
+      <w:proofErr w:type="spellEnd"/>
+    </w:p>
+    <w:p>
+      <w:pPr>
+        <w:pStyle w:val="ListParagraph"/>
+        <w:numPr>
+          <w:ilvl w:val="1"/>
+          <w:numId w:val="5"/>
+        </w:numPr>
+        <w:rPr>
+          <w:rFonts w:ascii="Times New Roman" w:hAnsi="Times New Roman" w:cs="Times New Roman"/>
+        </w:rPr>
+      </w:pPr>
+      <w:proofErr w:type="spellStart"/>
+      <w:r>
+        <w:rPr>
+          <w:rFonts w:ascii="Times New Roman" w:hAnsi="Times New Roman" w:cs="Times New Roman"/>
+        </w:rPr>
+        <w:t>CLPsych</w:t>
+      </w:r>
+      <w:proofErr w:type="spellEnd"/>
+      <w:r>
+        <w:rPr>
+          <w:rFonts w:ascii="Times New Roman" w:hAnsi="Times New Roman" w:cs="Times New Roman"/>
+        </w:rPr>
+        <w:t xml:space="preserve"> Shared Task</w:t>
+      </w:r>
+    </w:p>
+    <w:p>
+      <w:pPr>
+        <w:pStyle w:val="ListParagraph"/>
+        <w:numPr>
+          <w:ilvl w:val="1"/>
+          <w:numId w:val="5"/>
+        </w:numPr>
+        <w:rPr>
+          <w:rFonts w:ascii="Times New Roman" w:hAnsi="Times New Roman" w:cs="Times New Roman"/>
+        </w:rPr>
+      </w:pPr>
+      <w:proofErr w:type="spellStart"/>
+      <w:r>
+        <w:rPr>
+          <w:rFonts w:ascii="Times New Roman" w:hAnsi="Times New Roman" w:cs="Times New Roman"/>
+        </w:rPr>
+        <w:t>eRisk</w:t>
+      </w:r>
+      <w:proofErr w:type="spellEnd"/>
+    </w:p>
+    <w:p>
+      <w:pPr>
+        <w:pStyle w:val="ListParagraph"/>
+        <w:numPr>
+          <w:ilvl w:val="1"/>
+          <w:numId w:val="5"/>
+        </w:numPr>
+        <w:rPr>
+          <w:rFonts w:ascii="Times New Roman" w:hAnsi="Times New Roman" w:cs="Times New Roman"/>
+        </w:rPr>
+      </w:pPr>
+      <w:r>
+        <w:rPr>
+          <w:rFonts w:ascii="Times New Roman" w:hAnsi="Times New Roman" w:cs="Times New Roman"/>
+        </w:rPr>
+        <w:t>Mental Health Twitter</w:t>
+      </w:r>
+    </w:p>
+    <w:p>
+      <w:pPr>
+        <w:pStyle w:val="ListParagraph"/>
+        <w:numPr>
+          <w:ilvl w:val="1"/>
+          <w:numId w:val="5"/>
+        </w:numPr>
+        <w:rPr>
+          <w:rFonts w:ascii="Times New Roman" w:hAnsi="Times New Roman" w:cs="Times New Roman"/>
+        </w:rPr>
+      </w:pPr>
+      <w:r>
+        <w:rPr>
+          <w:rFonts w:ascii="Times New Roman" w:hAnsi="Times New Roman" w:cs="Times New Roman"/>
+        </w:rPr>
+        <w:t>LINGUINE</w:t>
+      </w:r>
+    </w:p>
+    <w:p>
+      <w:pPr>
+        <w:rPr>
+          <w:rFonts w:ascii="Times New Roman" w:hAnsi="Times New Roman" w:cs="Times New Roman"/>
+        </w:rPr>
+      </w:pPr>
+    </w:p>
+    <w:p>
+      <w:pPr>
+        <w:rPr>
+          <w:rFonts w:ascii="Times New Roman" w:hAnsi="Times New Roman" w:cs="Times New Roman"/>
+        </w:rPr>
+      </w:pPr>
+      <w:r>
+        <w:rPr>
+          <w:rFonts w:ascii="Times New Roman" w:hAnsi="Times New Roman" w:cs="Times New Roman"/>
+        </w:rPr>
+        <w:t>Feature 2: Integrate Model:</w:t>
+      </w:r>
+    </w:p>
+    <w:p>
+      <w:pPr>
+        <w:rPr>
+          <w:rFonts w:ascii="Times New Roman" w:hAnsi="Times New Roman" w:cs="Times New Roman"/>
+        </w:rPr>
+      </w:pPr>
     </w:p>
     <w:p>
       <w:pPr>
@@ -607,6 +846,95 @@
       </w:pPr>
     </w:lvl>
   </w:abstractNum>
+  <w:abstractNum w:abstractNumId="4" w15:restartNumberingAfterBreak="0">
+    <w:nsid w:val="7E316DD8"/>
+    <w:multiLevelType w:val="hybridMultilevel"/>
+    <w:tmpl w:val="6BBCAC50"/>
+    <w:lvl w:ilvl="0" w:tplc="0409000F">
+      <w:start w:val="1"/>
+      <w:numFmt w:val="decimal"/>
+      <w:lvlText w:val="%1."/>
+      <w:lvlJc w:val="left"/>
+      <w:pPr>
+        <w:ind w:left="720" w:hanging="360"/>
+      </w:pPr>
+      <w:rPr>
+        <w:rFonts w:hint="default"/>
+      </w:rPr>
+    </w:lvl>
+    <w:lvl w:ilvl="1" w:tplc="04090019">
+      <w:start w:val="1"/>
+      <w:numFmt w:val="lowerLetter"/>
+      <w:lvlText w:val="%2."/>
+      <w:lvlJc w:val="left"/>
+      <w:pPr>
+        <w:ind w:left="1440" w:hanging="360"/>
+      </w:pPr>
+    </w:lvl>
+    <w:lvl w:ilvl="2" w:tplc="0409001B">
+      <w:start w:val="1"/>
+      <w:numFmt w:val="lowerRoman"/>
+      <w:lvlText w:val="%3."/>
+      <w:lvlJc w:val="right"/>
+      <w:pPr>
+        <w:ind w:left="2160" w:hanging="180"/>
+      </w:pPr>
+    </w:lvl>
+    <w:lvl w:ilvl="3" w:tplc="0409000F" w:tentative="1">
+      <w:start w:val="1"/>
+      <w:numFmt w:val="decimal"/>
+      <w:lvlText w:val="%4."/>
+      <w:lvlJc w:val="left"/>
+      <w:pPr>
+        <w:ind w:left="2880" w:hanging="360"/>
+      </w:pPr>
+    </w:lvl>
+    <w:lvl w:ilvl="4" w:tplc="04090019" w:tentative="1">
+      <w:start w:val="1"/>
+      <w:numFmt w:val="lowerLetter"/>
+      <w:lvlText w:val="%5."/>
+      <w:lvlJc w:val="left"/>
+      <w:pPr>
+        <w:ind w:left="3600" w:hanging="360"/>
+      </w:pPr>
+    </w:lvl>
+    <w:lvl w:ilvl="5" w:tplc="0409001B" w:tentative="1">
+      <w:start w:val="1"/>
+      <w:numFmt w:val="lowerRoman"/>
+      <w:lvlText w:val="%6."/>
+      <w:lvlJc w:val="right"/>
+      <w:pPr>
+        <w:ind w:left="4320" w:hanging="180"/>
+      </w:pPr>
+    </w:lvl>
+    <w:lvl w:ilvl="6" w:tplc="0409000F" w:tentative="1">
+      <w:start w:val="1"/>
+      <w:numFmt w:val="decimal"/>
+      <w:lvlText w:val="%7."/>
+      <w:lvlJc w:val="left"/>
+      <w:pPr>
+        <w:ind w:left="5040" w:hanging="360"/>
+      </w:pPr>
+    </w:lvl>
+    <w:lvl w:ilvl="7" w:tplc="04090019" w:tentative="1">
+      <w:start w:val="1"/>
+      <w:numFmt w:val="lowerLetter"/>
+      <w:lvlText w:val="%8."/>
+      <w:lvlJc w:val="left"/>
+      <w:pPr>
+        <w:ind w:left="5760" w:hanging="360"/>
+      </w:pPr>
+    </w:lvl>
+    <w:lvl w:ilvl="8" w:tplc="0409001B" w:tentative="1">
+      <w:start w:val="1"/>
+      <w:numFmt w:val="lowerRoman"/>
+      <w:lvlText w:val="%9."/>
+      <w:lvlJc w:val="right"/>
+      <w:pPr>
+        <w:ind w:left="6480" w:hanging="180"/>
+      </w:pPr>
+    </w:lvl>
+  </w:abstractNum>
   <w:num w:numId="1" w16cid:durableId="327367144">
     <w:abstractNumId w:val="2"/>
   </w:num>
@@ -618,6 +946,9 @@
   </w:num>
   <w:num w:numId="4" w16cid:durableId="1536456393">
     <w:abstractNumId w:val="0"/>
+  </w:num>
+  <w:num w:numId="5" w16cid:durableId="1749233804">
+    <w:abstractNumId w:val="4"/>
   </w:num>
 </w:numbering>
 </file>

</xml_diff>